<commit_message>
chore: backup progress before system format
</commit_message>
<xml_diff>
--- a/plantillas/PAC_PC5_Congelacion_Enfriado_V15.docx
+++ b/plantillas/PAC_PC5_Congelacion_Enfriado_V15.docx
@@ -24,19 +24,6 @@
         </w:rPr>
         <w:t>R-PAC PC5</w:t>
       </w:r>
-    </w:p>
-    <w:p>
-      <w:pPr>
-        <w:spacing w:after="0" w:line="240" w:lineRule="auto"/>
-        <w:jc w:val="center"/>
-        <w:rPr>
-          <w:rFonts w:eastAsiaTheme="minorEastAsia" w:cs="Arial"/>
-          <w:b/>
-          <w:kern w:val="0"/>
-          <w:lang w:eastAsia="es-CL"/>
-          <w14:ligatures w14:val="none"/>
-        </w:rPr>
-      </w:pPr>
     </w:p>
     <w:p>
       <w:pPr>
@@ -200,6 +187,7 @@
                 <w14:ligatures w14:val="none"/>
               </w:rPr>
             </w:pPr>
+            <w:proofErr w:type="gramStart"/>
             <w:r>
               <w:rPr>
                 <w:rFonts w:eastAsia="Calibri" w:cs="Calibri"/>
@@ -213,6 +201,7 @@
               </w:rPr>
               <w:t>FECHA  INICIO</w:t>
             </w:r>
+            <w:proofErr w:type="gramEnd"/>
           </w:p>
         </w:tc>
         <w:tc>
@@ -298,33 +287,7 @@
                 <w:lang w:eastAsia="es-CL"/>
                 <w14:ligatures w14:val="none"/>
               </w:rPr>
-              <w:t>4</w:t>
-            </w:r>
-            <w:r>
-              <w:rPr>
-                <w:rFonts w:eastAsia="Calibri" w:cs="Calibri"/>
-                <w:b/>
-                <w:bCs/>
-                <w:kern w:val="0"/>
-                <w:sz w:val="24"/>
-                <w:szCs w:val="24"/>
-                <w:lang w:eastAsia="es-CL"/>
-                <w14:ligatures w14:val="none"/>
-              </w:rPr>
-              <w:t>1</w:t>
-            </w:r>
-            <w:r>
-              <w:rPr>
-                <w:rFonts w:eastAsia="Calibri" w:cs="Calibri"/>
-                <w:b/>
-                <w:bCs/>
-                <w:kern w:val="0"/>
-                <w:sz w:val="24"/>
-                <w:szCs w:val="24"/>
-                <w:lang w:eastAsia="es-CL"/>
-                <w14:ligatures w14:val="none"/>
-              </w:rPr>
-              <w:t>4</w:t>
+              <w:t>826</w:t>
             </w:r>
           </w:p>
         </w:tc>
@@ -783,12 +746,34 @@
             <w:r>
               <w:rPr>
                 <w:rFonts w:eastAsiaTheme="minorEastAsia" w:cs="Arial"/>
-                <w:color w:val="215E99" w:themeColor="text2" w:themeTint="BF"/>
+                <w:color w:val="000000" w:themeColor="text1"/>
                 <w:kern w:val="0"/>
                 <w:lang w:eastAsia="es-CL"/>
                 <w14:ligatures w14:val="none"/>
               </w:rPr>
-              <w:t>Control temperaturas °C   LIBERACIÓN DE TUNEL  A/R</w:t>
+              <w:t xml:space="preserve">Control temperaturas °C   LIBERACIÓN DE </w:t>
+            </w:r>
+            <w:proofErr w:type="gramStart"/>
+            <w:r>
+              <w:rPr>
+                <w:rFonts w:eastAsiaTheme="minorEastAsia" w:cs="Arial"/>
+                <w:color w:val="000000" w:themeColor="text1"/>
+                <w:kern w:val="0"/>
+                <w:lang w:eastAsia="es-CL"/>
+                <w14:ligatures w14:val="none"/>
+              </w:rPr>
+              <w:t>TUNEL  A</w:t>
+            </w:r>
+            <w:proofErr w:type="gramEnd"/>
+            <w:r>
+              <w:rPr>
+                <w:rFonts w:eastAsiaTheme="minorEastAsia" w:cs="Arial"/>
+                <w:color w:val="000000" w:themeColor="text1"/>
+                <w:kern w:val="0"/>
+                <w:lang w:eastAsia="es-CL"/>
+                <w14:ligatures w14:val="none"/>
+              </w:rPr>
+              <w:t>/R</w:t>
             </w:r>
           </w:p>
         </w:tc>
@@ -884,7 +869,7 @@
                 <w:rFonts w:cs="Arial"/>
                 <w:b/>
                 <w:bCs/>
-                <w:color w:val="215E99" w:themeColor="text2" w:themeTint="BF"/>
+                <w:color w:val="000000" w:themeColor="text1"/>
                 <w:sz w:val="16"/>
                 <w:szCs w:val="16"/>
               </w:rPr>
@@ -995,6 +980,7 @@
                 <w:szCs w:val="16"/>
               </w:rPr>
             </w:pPr>
+            <w:proofErr w:type="spellStart"/>
             <w:r>
               <w:rPr>
                 <w:rFonts w:cs="Arial"/>
@@ -1003,7 +989,18 @@
                 <w:sz w:val="16"/>
                 <w:szCs w:val="16"/>
               </w:rPr>
-              <w:t xml:space="preserve">T° 1 </w:t>
+              <w:t>T°</w:t>
+            </w:r>
+            <w:proofErr w:type="spellEnd"/>
+            <w:r>
+              <w:rPr>
+                <w:rFonts w:cs="Arial"/>
+                <w:b/>
+                <w:bCs/>
+                <w:sz w:val="16"/>
+                <w:szCs w:val="16"/>
+              </w:rPr>
+              <w:t xml:space="preserve"> 1 </w:t>
             </w:r>
           </w:p>
         </w:tc>
@@ -1022,6 +1019,7 @@
                 <w:szCs w:val="16"/>
               </w:rPr>
             </w:pPr>
+            <w:proofErr w:type="spellStart"/>
             <w:r>
               <w:rPr>
                 <w:rFonts w:cs="Arial"/>
@@ -1030,7 +1028,18 @@
                 <w:sz w:val="16"/>
                 <w:szCs w:val="16"/>
               </w:rPr>
-              <w:t>T° 2</w:t>
+              <w:t>T°</w:t>
+            </w:r>
+            <w:proofErr w:type="spellEnd"/>
+            <w:r>
+              <w:rPr>
+                <w:rFonts w:cs="Arial"/>
+                <w:b/>
+                <w:bCs/>
+                <w:sz w:val="16"/>
+                <w:szCs w:val="16"/>
+              </w:rPr>
+              <w:t xml:space="preserve"> 2</w:t>
             </w:r>
           </w:p>
         </w:tc>
@@ -1049,6 +1058,7 @@
                 <w:szCs w:val="16"/>
               </w:rPr>
             </w:pPr>
+            <w:proofErr w:type="spellStart"/>
             <w:r>
               <w:rPr>
                 <w:rFonts w:cs="Arial"/>
@@ -1057,7 +1067,18 @@
                 <w:sz w:val="16"/>
                 <w:szCs w:val="16"/>
               </w:rPr>
-              <w:t>T° 3</w:t>
+              <w:t>T°</w:t>
+            </w:r>
+            <w:proofErr w:type="spellEnd"/>
+            <w:r>
+              <w:rPr>
+                <w:rFonts w:cs="Arial"/>
+                <w:b/>
+                <w:bCs/>
+                <w:sz w:val="16"/>
+                <w:szCs w:val="16"/>
+              </w:rPr>
+              <w:t xml:space="preserve"> 3</w:t>
             </w:r>
           </w:p>
         </w:tc>
@@ -1076,6 +1097,7 @@
                 <w:szCs w:val="16"/>
               </w:rPr>
             </w:pPr>
+            <w:proofErr w:type="spellStart"/>
             <w:r>
               <w:rPr>
                 <w:rFonts w:cs="Arial"/>
@@ -1084,7 +1106,18 @@
                 <w:sz w:val="16"/>
                 <w:szCs w:val="16"/>
               </w:rPr>
-              <w:t>T° 4</w:t>
+              <w:t>T°</w:t>
+            </w:r>
+            <w:proofErr w:type="spellEnd"/>
+            <w:r>
+              <w:rPr>
+                <w:rFonts w:cs="Arial"/>
+                <w:b/>
+                <w:bCs/>
+                <w:sz w:val="16"/>
+                <w:szCs w:val="16"/>
+              </w:rPr>
+              <w:t xml:space="preserve"> 4</w:t>
             </w:r>
           </w:p>
         </w:tc>
@@ -1103,6 +1136,7 @@
                 <w:szCs w:val="16"/>
               </w:rPr>
             </w:pPr>
+            <w:proofErr w:type="spellStart"/>
             <w:r>
               <w:rPr>
                 <w:rFonts w:cs="Arial"/>
@@ -1111,7 +1145,18 @@
                 <w:sz w:val="16"/>
                 <w:szCs w:val="16"/>
               </w:rPr>
-              <w:t>T° 5</w:t>
+              <w:t>T°</w:t>
+            </w:r>
+            <w:proofErr w:type="spellEnd"/>
+            <w:r>
+              <w:rPr>
+                <w:rFonts w:cs="Arial"/>
+                <w:b/>
+                <w:bCs/>
+                <w:sz w:val="16"/>
+                <w:szCs w:val="16"/>
+              </w:rPr>
+              <w:t xml:space="preserve"> 5</w:t>
             </w:r>
           </w:p>
         </w:tc>
@@ -2360,13 +2405,60 @@
           <w:lang w:eastAsia="es-CL"/>
           <w14:ligatures w14:val="none"/>
         </w:rPr>
-        <w:t>Plan de Muestreo: según NCh 44 of 78, S1 (n=5; Ac=0; Re=1; AQL= 2,5).</w:t>
+        <w:t xml:space="preserve">Plan de Muestreo: según </w:t>
+      </w:r>
+      <w:proofErr w:type="spellStart"/>
+      <w:r>
+        <w:rPr>
+          <w:rFonts w:eastAsiaTheme="minorEastAsia" w:cs="Arial"/>
+          <w:kern w:val="0"/>
+          <w:sz w:val="16"/>
+          <w:szCs w:val="16"/>
+          <w:lang w:eastAsia="es-CL"/>
+          <w14:ligatures w14:val="none"/>
+        </w:rPr>
+        <w:t>NCh</w:t>
+      </w:r>
+      <w:proofErr w:type="spellEnd"/>
+      <w:r>
+        <w:rPr>
+          <w:rFonts w:eastAsiaTheme="minorEastAsia" w:cs="Arial"/>
+          <w:kern w:val="0"/>
+          <w:sz w:val="16"/>
+          <w:szCs w:val="16"/>
+          <w:lang w:eastAsia="es-CL"/>
+          <w14:ligatures w14:val="none"/>
+        </w:rPr>
+        <w:t xml:space="preserve"> 44 </w:t>
+      </w:r>
+      <w:proofErr w:type="spellStart"/>
+      <w:r>
+        <w:rPr>
+          <w:rFonts w:eastAsiaTheme="minorEastAsia" w:cs="Arial"/>
+          <w:kern w:val="0"/>
+          <w:sz w:val="16"/>
+          <w:szCs w:val="16"/>
+          <w:lang w:eastAsia="es-CL"/>
+          <w14:ligatures w14:val="none"/>
+        </w:rPr>
+        <w:t>of</w:t>
+      </w:r>
+      <w:proofErr w:type="spellEnd"/>
+      <w:r>
+        <w:rPr>
+          <w:rFonts w:eastAsiaTheme="minorEastAsia" w:cs="Arial"/>
+          <w:kern w:val="0"/>
+          <w:sz w:val="16"/>
+          <w:szCs w:val="16"/>
+          <w:lang w:eastAsia="es-CL"/>
+          <w14:ligatures w14:val="none"/>
+        </w:rPr>
+        <w:t xml:space="preserve"> 78, S1 (n=5; Ac=0; Re=1; AQL= 2,5).</w:t>
       </w:r>
     </w:p>
     <w:p>
       <w:pPr>
         <w:spacing w:after="0" w:line="240" w:lineRule="auto"/>
-        <w:jc w:val="both"/>
         <w:rPr>
           <w:rFonts w:eastAsiaTheme="minorEastAsia" w:cs="Arial"/>
           <w:kern w:val="0"/>
@@ -2385,13 +2477,36 @@
           <w:lang w:eastAsia="es-CL"/>
           <w14:ligatures w14:val="none"/>
         </w:rPr>
-        <w:t xml:space="preserve">Frecuencia: Cada vez que se retire producto del equipo para el Enfriado Refrigerado o a la salida de cada bach de congelación. Monitoreo: se verifica la temperatura, registrándose además con el tiempo de permanencia del producto en el túnel. </w:t>
+        <w:t xml:space="preserve">Frecuencia: Cada vez que se retire producto del equipo para el Enfriado Refrigerado o a la salida de cada </w:t>
+      </w:r>
+      <w:proofErr w:type="spellStart"/>
+      <w:r>
+        <w:rPr>
+          <w:rFonts w:eastAsiaTheme="minorEastAsia" w:cs="Arial"/>
+          <w:kern w:val="0"/>
+          <w:sz w:val="16"/>
+          <w:szCs w:val="16"/>
+          <w:lang w:eastAsia="es-CL"/>
+          <w14:ligatures w14:val="none"/>
+        </w:rPr>
+        <w:t>bach</w:t>
+      </w:r>
+      <w:proofErr w:type="spellEnd"/>
+      <w:r>
+        <w:rPr>
+          <w:rFonts w:eastAsiaTheme="minorEastAsia" w:cs="Arial"/>
+          <w:kern w:val="0"/>
+          <w:sz w:val="16"/>
+          <w:szCs w:val="16"/>
+          <w:lang w:eastAsia="es-CL"/>
+          <w14:ligatures w14:val="none"/>
+        </w:rPr>
+        <w:t xml:space="preserve"> de congelación. Monitoreo: se verifica la temperatura, registrándose además con el tiempo de permanencia del producto en el túnel. </w:t>
       </w:r>
     </w:p>
     <w:p>
       <w:pPr>
         <w:spacing w:after="0" w:line="240" w:lineRule="auto"/>
-        <w:jc w:val="both"/>
         <w:rPr>
           <w:rFonts w:eastAsiaTheme="minorEastAsia" w:cs="Arial"/>
           <w:kern w:val="0"/>
@@ -2410,13 +2525,36 @@
           <w:lang w:eastAsia="es-CL"/>
           <w14:ligatures w14:val="none"/>
         </w:rPr>
-        <w:t>A.C: El producto debe ser sometido a un nuevo proceso térmico, luego de lo cual se debe verificar y registrar la T°C de salida el producto. Si no observan problemas de presentación, seguirá el flujo de producción.</w:t>
+        <w:t xml:space="preserve">A.C: El producto debe ser sometido a un nuevo proceso térmico, luego de lo cual se debe verificar y registrar la </w:t>
+      </w:r>
+      <w:proofErr w:type="spellStart"/>
+      <w:r>
+        <w:rPr>
+          <w:rFonts w:eastAsiaTheme="minorEastAsia" w:cs="Arial"/>
+          <w:kern w:val="0"/>
+          <w:sz w:val="16"/>
+          <w:szCs w:val="16"/>
+          <w:lang w:eastAsia="es-CL"/>
+          <w14:ligatures w14:val="none"/>
+        </w:rPr>
+        <w:t>T°C</w:t>
+      </w:r>
+      <w:proofErr w:type="spellEnd"/>
+      <w:r>
+        <w:rPr>
+          <w:rFonts w:eastAsiaTheme="minorEastAsia" w:cs="Arial"/>
+          <w:kern w:val="0"/>
+          <w:sz w:val="16"/>
+          <w:szCs w:val="16"/>
+          <w:lang w:eastAsia="es-CL"/>
+          <w14:ligatures w14:val="none"/>
+        </w:rPr>
+        <w:t xml:space="preserve"> de salida el producto. Si no observan problemas de presentación, seguirá el flujo de producción.</w:t>
       </w:r>
     </w:p>
     <w:p>
       <w:pPr>
         <w:spacing w:after="0" w:line="240" w:lineRule="auto"/>
-        <w:jc w:val="both"/>
         <w:rPr>
           <w:rFonts w:eastAsiaTheme="minorEastAsia" w:cs="Arial"/>
           <w:kern w:val="0"/>
@@ -2457,7 +2595,31 @@
           <w:lang w:eastAsia="es-CL"/>
           <w14:ligatures w14:val="none"/>
         </w:rPr>
-        <w:t xml:space="preserve"> horas. Y de enfriado refrigerado a una t° no superior a 4°C por un tiempo de 48 horas como máximo</w:t>
+        <w:t xml:space="preserve"> horas. Y de enfriado refrigerado a una </w:t>
+      </w:r>
+      <w:proofErr w:type="spellStart"/>
+      <w:r>
+        <w:rPr>
+          <w:rFonts w:eastAsiaTheme="minorEastAsia" w:cs="Arial"/>
+          <w:kern w:val="0"/>
+          <w:sz w:val="16"/>
+          <w:szCs w:val="16"/>
+          <w:lang w:eastAsia="es-CL"/>
+          <w14:ligatures w14:val="none"/>
+        </w:rPr>
+        <w:t>t°</w:t>
+      </w:r>
+      <w:proofErr w:type="spellEnd"/>
+      <w:r>
+        <w:rPr>
+          <w:rFonts w:eastAsiaTheme="minorEastAsia" w:cs="Arial"/>
+          <w:kern w:val="0"/>
+          <w:sz w:val="16"/>
+          <w:szCs w:val="16"/>
+          <w:lang w:eastAsia="es-CL"/>
+          <w14:ligatures w14:val="none"/>
+        </w:rPr>
+        <w:t xml:space="preserve"> no superior a 4°C por un tiempo de 48 horas como máximo</w:t>
       </w:r>
     </w:p>
     <w:p>
@@ -2476,8 +2638,8 @@
     </w:p>
     <w:tbl>
       <w:tblPr>
-        <w:tblW w:w="4349" w:type="dxa"/>
-        <w:tblInd w:w="55" w:type="dxa"/>
+        <w:tblW w:w="9214" w:type="dxa"/>
+        <w:tblInd w:w="-5" w:type="dxa"/>
         <w:tblCellMar>
           <w:left w:w="70" w:type="dxa"/>
           <w:right w:w="70" w:type="dxa"/>
@@ -2485,21 +2647,21 @@
         <w:tblLook w:val="04A0" w:firstRow="1" w:lastRow="0" w:firstColumn="1" w:lastColumn="0" w:noHBand="0" w:noVBand="1"/>
       </w:tblPr>
       <w:tblGrid>
-        <w:gridCol w:w="999"/>
-        <w:gridCol w:w="387"/>
-        <w:gridCol w:w="387"/>
-        <w:gridCol w:w="489"/>
-        <w:gridCol w:w="693"/>
-        <w:gridCol w:w="1223"/>
-        <w:gridCol w:w="171"/>
+        <w:gridCol w:w="650"/>
+        <w:gridCol w:w="253"/>
+        <w:gridCol w:w="235"/>
+        <w:gridCol w:w="282"/>
+        <w:gridCol w:w="404"/>
+        <w:gridCol w:w="2008"/>
+        <w:gridCol w:w="5382"/>
       </w:tblGrid>
       <w:tr>
         <w:trPr>
-          <w:trHeight w:val="302"/>
+          <w:trHeight w:val="258"/>
         </w:trPr>
         <w:tc>
           <w:tcPr>
-            <w:tcW w:w="999" w:type="dxa"/>
+            <w:tcW w:w="650" w:type="dxa"/>
             <w:tcBorders>
               <w:top w:val="single" w:sz="4" w:space="0" w:color="auto"/>
               <w:left w:val="single" w:sz="4" w:space="0" w:color="auto"/>
@@ -2533,7 +2695,7 @@
         </w:tc>
         <w:tc>
           <w:tcPr>
-            <w:tcW w:w="387" w:type="dxa"/>
+            <w:tcW w:w="253" w:type="dxa"/>
             <w:tcBorders>
               <w:top w:val="single" w:sz="4" w:space="0" w:color="auto"/>
               <w:left w:val="nil"/>
@@ -2567,7 +2729,7 @@
         </w:tc>
         <w:tc>
           <w:tcPr>
-            <w:tcW w:w="387" w:type="dxa"/>
+            <w:tcW w:w="235" w:type="dxa"/>
             <w:tcBorders>
               <w:top w:val="single" w:sz="4" w:space="0" w:color="auto"/>
               <w:left w:val="nil"/>
@@ -2601,7 +2763,7 @@
         </w:tc>
         <w:tc>
           <w:tcPr>
-            <w:tcW w:w="489" w:type="dxa"/>
+            <w:tcW w:w="282" w:type="dxa"/>
             <w:tcBorders>
               <w:top w:val="single" w:sz="4" w:space="0" w:color="auto"/>
               <w:left w:val="nil"/>
@@ -2635,10 +2797,10 @@
         </w:tc>
         <w:tc>
           <w:tcPr>
-            <w:tcW w:w="693" w:type="dxa"/>
+            <w:tcW w:w="404" w:type="dxa"/>
             <w:tcBorders>
               <w:top w:val="nil"/>
-              <w:left w:val="nil"/>
+              <w:left w:val="single" w:sz="4" w:space="0" w:color="auto"/>
               <w:bottom w:val="nil"/>
               <w:right w:val="nil"/>
             </w:tcBorders>
@@ -2658,12 +2820,12 @@
         </w:tc>
         <w:tc>
           <w:tcPr>
-            <w:tcW w:w="1223" w:type="dxa"/>
+            <w:tcW w:w="2008" w:type="dxa"/>
             <w:tcBorders>
               <w:top w:val="nil"/>
               <w:left w:val="nil"/>
               <w:bottom w:val="nil"/>
-              <w:right w:val="nil"/>
+              <w:right w:val="single" w:sz="4" w:space="0" w:color="auto"/>
             </w:tcBorders>
             <w:noWrap/>
             <w:vAlign w:val="bottom"/>
@@ -2672,6 +2834,7 @@
           <w:p>
             <w:pPr>
               <w:spacing w:after="0" w:line="240" w:lineRule="auto"/>
+              <w:jc w:val="center"/>
               <w:rPr>
                 <w:rFonts w:eastAsia="Times New Roman" w:cs="Times New Roman"/>
                 <w:lang w:eastAsia="es-CL"/>
@@ -2681,20 +2844,19 @@
         </w:tc>
         <w:tc>
           <w:tcPr>
-            <w:tcW w:w="171" w:type="dxa"/>
+            <w:tcW w:w="5382" w:type="dxa"/>
             <w:tcBorders>
-              <w:top w:val="nil"/>
-              <w:left w:val="nil"/>
-              <w:bottom w:val="nil"/>
-              <w:right w:val="nil"/>
+              <w:top w:val="single" w:sz="4" w:space="0" w:color="auto"/>
+              <w:left w:val="single" w:sz="4" w:space="0" w:color="auto"/>
+              <w:bottom w:val="single" w:sz="4" w:space="0" w:color="auto"/>
+              <w:right w:val="single" w:sz="4" w:space="0" w:color="auto"/>
             </w:tcBorders>
-            <w:noWrap/>
-            <w:vAlign w:val="bottom"/>
-            <w:hideMark/>
+            <w:shd w:val="clear" w:color="auto" w:fill="FF7474"/>
           </w:tcPr>
           <w:p>
             <w:pPr>
               <w:spacing w:after="0" w:line="240" w:lineRule="auto"/>
+              <w:jc w:val="center"/>
               <w:rPr>
                 <w:rFonts w:eastAsia="Times New Roman" w:cs="Times New Roman"/>
                 <w:b/>
@@ -2704,18 +2866,29 @@
                 <w:lang w:eastAsia="es-CL"/>
               </w:rPr>
             </w:pPr>
+            <w:r>
+              <w:rPr>
+                <w:rFonts w:eastAsia="Times New Roman" w:cs="Times New Roman"/>
+                <w:b/>
+                <w:bCs/>
+                <w:sz w:val="16"/>
+                <w:szCs w:val="16"/>
+                <w:lang w:eastAsia="es-CL"/>
+              </w:rPr>
+              <w:t>Control 72 horas</w:t>
+            </w:r>
           </w:p>
         </w:tc>
       </w:tr>
       <w:tr>
         <w:trPr>
-          <w:trHeight w:val="302"/>
+          <w:trHeight w:val="300"/>
         </w:trPr>
         <w:tc>
           <w:tcPr>
-            <w:tcW w:w="999" w:type="dxa"/>
+            <w:tcW w:w="650" w:type="dxa"/>
             <w:tcBorders>
-              <w:top w:val="nil"/>
+              <w:top w:val="single" w:sz="4" w:space="0" w:color="auto"/>
               <w:left w:val="single" w:sz="4" w:space="0" w:color="auto"/>
               <w:bottom w:val="single" w:sz="4" w:space="0" w:color="auto"/>
               <w:right w:val="single" w:sz="4" w:space="0" w:color="auto"/>
@@ -2741,15 +2914,35 @@
                 <w:szCs w:val="16"/>
                 <w:lang w:eastAsia="es-CL"/>
               </w:rPr>
-              <w:t>501 A 35000</w:t>
+              <w:t xml:space="preserve">501 </w:t>
             </w:r>
-          </w:p>
-        </w:tc>
-        <w:tc>
-          <w:tcPr>
-            <w:tcW w:w="387" w:type="dxa"/>
+            <w:proofErr w:type="gramStart"/>
+            <w:r>
+              <w:rPr>
+                <w:rFonts w:eastAsia="Times New Roman" w:cs="Times New Roman"/>
+                <w:sz w:val="16"/>
+                <w:szCs w:val="16"/>
+                <w:lang w:eastAsia="es-CL"/>
+              </w:rPr>
+              <w:t>A</w:t>
+            </w:r>
+            <w:proofErr w:type="gramEnd"/>
+            <w:r>
+              <w:rPr>
+                <w:rFonts w:eastAsia="Times New Roman" w:cs="Times New Roman"/>
+                <w:sz w:val="16"/>
+                <w:szCs w:val="16"/>
+                <w:lang w:eastAsia="es-CL"/>
+              </w:rPr>
+              <w:t xml:space="preserve"> 35000</w:t>
+            </w:r>
+          </w:p>
+        </w:tc>
+        <w:tc>
+          <w:tcPr>
+            <w:tcW w:w="253" w:type="dxa"/>
             <w:tcBorders>
-              <w:top w:val="nil"/>
+              <w:top w:val="single" w:sz="4" w:space="0" w:color="auto"/>
               <w:left w:val="nil"/>
               <w:bottom w:val="single" w:sz="4" w:space="0" w:color="auto"/>
               <w:right w:val="single" w:sz="4" w:space="0" w:color="auto"/>
@@ -2781,9 +2974,9 @@
         </w:tc>
         <w:tc>
           <w:tcPr>
-            <w:tcW w:w="387" w:type="dxa"/>
+            <w:tcW w:w="235" w:type="dxa"/>
             <w:tcBorders>
-              <w:top w:val="nil"/>
+              <w:top w:val="single" w:sz="4" w:space="0" w:color="auto"/>
               <w:left w:val="nil"/>
               <w:bottom w:val="single" w:sz="4" w:space="0" w:color="auto"/>
               <w:right w:val="single" w:sz="4" w:space="0" w:color="auto"/>
@@ -2815,9 +3008,9 @@
         </w:tc>
         <w:tc>
           <w:tcPr>
-            <w:tcW w:w="489" w:type="dxa"/>
+            <w:tcW w:w="282" w:type="dxa"/>
             <w:tcBorders>
-              <w:top w:val="nil"/>
+              <w:top w:val="single" w:sz="4" w:space="0" w:color="auto"/>
               <w:left w:val="nil"/>
               <w:bottom w:val="single" w:sz="4" w:space="0" w:color="auto"/>
               <w:right w:val="single" w:sz="4" w:space="0" w:color="auto"/>
@@ -2849,11 +3042,10 @@
         </w:tc>
         <w:tc>
           <w:tcPr>
-            <w:tcW w:w="693" w:type="dxa"/>
+            <w:tcW w:w="404" w:type="dxa"/>
             <w:tcBorders>
               <w:top w:val="nil"/>
-              <w:left w:val="nil"/>
-              <w:bottom w:val="nil"/>
+              <w:left w:val="single" w:sz="4" w:space="0" w:color="auto"/>
               <w:right w:val="nil"/>
             </w:tcBorders>
             <w:noWrap/>
@@ -2872,16 +3064,165 @@
         </w:tc>
         <w:tc>
           <w:tcPr>
-            <w:tcW w:w="1223" w:type="dxa"/>
+            <w:tcW w:w="2008" w:type="dxa"/>
             <w:tcBorders>
               <w:top w:val="nil"/>
               <w:left w:val="nil"/>
               <w:bottom w:val="nil"/>
+              <w:right w:val="single" w:sz="4" w:space="0" w:color="auto"/>
+            </w:tcBorders>
+            <w:noWrap/>
+            <w:vAlign w:val="bottom"/>
+            <w:hideMark/>
+          </w:tcPr>
+          <w:p>
+            <w:pPr>
+              <w:spacing w:after="0" w:line="240" w:lineRule="auto"/>
+              <w:rPr>
+                <w:rFonts w:eastAsia="Times New Roman" w:cs="Times New Roman"/>
+                <w:lang w:eastAsia="es-CL"/>
+              </w:rPr>
+            </w:pPr>
+          </w:p>
+        </w:tc>
+        <w:tc>
+          <w:tcPr>
+            <w:tcW w:w="5382" w:type="dxa"/>
+            <w:tcBorders>
+              <w:top w:val="single" w:sz="4" w:space="0" w:color="auto"/>
+              <w:left w:val="single" w:sz="4" w:space="0" w:color="auto"/>
+              <w:bottom w:val="single" w:sz="4" w:space="0" w:color="auto"/>
+              <w:right w:val="single" w:sz="4" w:space="0" w:color="auto"/>
+            </w:tcBorders>
+          </w:tcPr>
+          <w:p>
+            <w:pPr>
+              <w:spacing w:after="0" w:line="240" w:lineRule="auto"/>
+              <w:rPr>
+                <w:rFonts w:eastAsia="Times New Roman" w:cs="Times New Roman"/>
+                <w:lang w:eastAsia="es-CL"/>
+              </w:rPr>
+            </w:pPr>
+            <w:r>
+              <w:rPr>
+                <w:rFonts w:eastAsia="Times New Roman" w:cs="Times New Roman"/>
+                <w:lang w:eastAsia="es-CL"/>
+              </w:rPr>
+              <w:t xml:space="preserve">Cumplimiento de 72 hora:             </w:t>
+            </w:r>
+            <w:r>
+              <w:rPr>
+                <w:rFonts w:eastAsia="Times New Roman" w:cs="Times New Roman"/>
+                <w:lang w:eastAsia="es-CL"/>
+              </w:rPr>
+              <w:t xml:space="preserve">     </w:t>
+            </w:r>
+            <w:r>
+              <w:rPr>
+                <w:rFonts w:eastAsia="Times New Roman" w:cs="Times New Roman"/>
+                <w:lang w:eastAsia="es-CL"/>
+              </w:rPr>
+              <w:t xml:space="preserve">  fecha:             </w:t>
+            </w:r>
+          </w:p>
+        </w:tc>
+      </w:tr>
+      <w:tr>
+        <w:trPr>
+          <w:trHeight w:val="300"/>
+        </w:trPr>
+        <w:tc>
+          <w:tcPr>
+            <w:tcW w:w="650" w:type="dxa"/>
+            <w:tcBorders>
+              <w:top w:val="single" w:sz="4" w:space="0" w:color="auto"/>
+            </w:tcBorders>
+            <w:vAlign w:val="center"/>
+          </w:tcPr>
+          <w:p>
+            <w:pPr>
+              <w:spacing w:after="0" w:line="240" w:lineRule="auto"/>
+              <w:jc w:val="both"/>
+              <w:rPr>
+                <w:rFonts w:eastAsia="Times New Roman" w:cs="Times New Roman"/>
+                <w:sz w:val="16"/>
+                <w:szCs w:val="16"/>
+                <w:lang w:eastAsia="es-CL"/>
+              </w:rPr>
+            </w:pPr>
+          </w:p>
+        </w:tc>
+        <w:tc>
+          <w:tcPr>
+            <w:tcW w:w="253" w:type="dxa"/>
+            <w:tcBorders>
+              <w:top w:val="single" w:sz="4" w:space="0" w:color="auto"/>
+            </w:tcBorders>
+            <w:vAlign w:val="center"/>
+          </w:tcPr>
+          <w:p>
+            <w:pPr>
+              <w:spacing w:after="0" w:line="240" w:lineRule="auto"/>
+              <w:jc w:val="both"/>
+              <w:rPr>
+                <w:rFonts w:eastAsia="Times New Roman" w:cs="Times New Roman"/>
+                <w:sz w:val="16"/>
+                <w:szCs w:val="16"/>
+                <w:lang w:eastAsia="es-CL"/>
+              </w:rPr>
+            </w:pPr>
+          </w:p>
+        </w:tc>
+        <w:tc>
+          <w:tcPr>
+            <w:tcW w:w="235" w:type="dxa"/>
+            <w:tcBorders>
+              <w:top w:val="single" w:sz="4" w:space="0" w:color="auto"/>
+            </w:tcBorders>
+            <w:vAlign w:val="center"/>
+          </w:tcPr>
+          <w:p>
+            <w:pPr>
+              <w:spacing w:after="0" w:line="240" w:lineRule="auto"/>
+              <w:jc w:val="both"/>
+              <w:rPr>
+                <w:rFonts w:eastAsia="Times New Roman" w:cs="Times New Roman"/>
+                <w:sz w:val="16"/>
+                <w:szCs w:val="16"/>
+                <w:lang w:eastAsia="es-CL"/>
+              </w:rPr>
+            </w:pPr>
+          </w:p>
+        </w:tc>
+        <w:tc>
+          <w:tcPr>
+            <w:tcW w:w="282" w:type="dxa"/>
+            <w:tcBorders>
+              <w:top w:val="single" w:sz="4" w:space="0" w:color="auto"/>
+            </w:tcBorders>
+            <w:vAlign w:val="center"/>
+          </w:tcPr>
+          <w:p>
+            <w:pPr>
+              <w:spacing w:after="0" w:line="240" w:lineRule="auto"/>
+              <w:jc w:val="both"/>
+              <w:rPr>
+                <w:rFonts w:eastAsia="Times New Roman" w:cs="Times New Roman"/>
+                <w:sz w:val="16"/>
+                <w:szCs w:val="16"/>
+                <w:lang w:eastAsia="es-CL"/>
+              </w:rPr>
+            </w:pPr>
+          </w:p>
+        </w:tc>
+        <w:tc>
+          <w:tcPr>
+            <w:tcW w:w="404" w:type="dxa"/>
+            <w:tcBorders>
               <w:right w:val="nil"/>
             </w:tcBorders>
             <w:noWrap/>
             <w:vAlign w:val="bottom"/>
-            <w:hideMark/>
           </w:tcPr>
           <w:p>
             <w:pPr>
@@ -2895,16 +3236,311 @@
         </w:tc>
         <w:tc>
           <w:tcPr>
-            <w:tcW w:w="171" w:type="dxa"/>
+            <w:tcW w:w="2008" w:type="dxa"/>
             <w:tcBorders>
               <w:top w:val="nil"/>
               <w:left w:val="nil"/>
               <w:bottom w:val="nil"/>
+              <w:right w:val="single" w:sz="4" w:space="0" w:color="auto"/>
+            </w:tcBorders>
+            <w:noWrap/>
+            <w:vAlign w:val="bottom"/>
+          </w:tcPr>
+          <w:p>
+            <w:pPr>
+              <w:spacing w:after="0" w:line="240" w:lineRule="auto"/>
+              <w:rPr>
+                <w:rFonts w:eastAsia="Times New Roman" w:cs="Times New Roman"/>
+                <w:lang w:eastAsia="es-CL"/>
+              </w:rPr>
+            </w:pPr>
+          </w:p>
+        </w:tc>
+        <w:tc>
+          <w:tcPr>
+            <w:tcW w:w="5382" w:type="dxa"/>
+            <w:tcBorders>
+              <w:top w:val="single" w:sz="4" w:space="0" w:color="auto"/>
+              <w:left w:val="single" w:sz="4" w:space="0" w:color="auto"/>
+              <w:bottom w:val="single" w:sz="4" w:space="0" w:color="auto"/>
+              <w:right w:val="single" w:sz="4" w:space="0" w:color="auto"/>
+            </w:tcBorders>
+          </w:tcPr>
+          <w:p>
+            <w:pPr>
+              <w:spacing w:after="0" w:line="240" w:lineRule="auto"/>
+              <w:rPr>
+                <w:rFonts w:eastAsia="Times New Roman" w:cs="Times New Roman"/>
+                <w:lang w:eastAsia="es-CL"/>
+              </w:rPr>
+            </w:pPr>
+            <w:r>
+              <w:rPr>
+                <w:rFonts w:eastAsia="Times New Roman" w:cs="Times New Roman"/>
+                <w:lang w:eastAsia="es-CL"/>
+              </w:rPr>
+              <w:t>Temperatura</w:t>
+            </w:r>
+          </w:p>
+        </w:tc>
+      </w:tr>
+      <w:tr>
+        <w:trPr>
+          <w:trHeight w:val="300"/>
+        </w:trPr>
+        <w:tc>
+          <w:tcPr>
+            <w:tcW w:w="650" w:type="dxa"/>
+            <w:vAlign w:val="center"/>
+          </w:tcPr>
+          <w:p>
+            <w:pPr>
+              <w:spacing w:after="0" w:line="240" w:lineRule="auto"/>
+              <w:jc w:val="both"/>
+              <w:rPr>
+                <w:rFonts w:eastAsia="Times New Roman" w:cs="Times New Roman"/>
+                <w:sz w:val="16"/>
+                <w:szCs w:val="16"/>
+                <w:lang w:eastAsia="es-CL"/>
+              </w:rPr>
+            </w:pPr>
+          </w:p>
+        </w:tc>
+        <w:tc>
+          <w:tcPr>
+            <w:tcW w:w="253" w:type="dxa"/>
+            <w:vAlign w:val="center"/>
+          </w:tcPr>
+          <w:p>
+            <w:pPr>
+              <w:spacing w:after="0" w:line="240" w:lineRule="auto"/>
+              <w:jc w:val="both"/>
+              <w:rPr>
+                <w:rFonts w:eastAsia="Times New Roman" w:cs="Times New Roman"/>
+                <w:sz w:val="16"/>
+                <w:szCs w:val="16"/>
+                <w:lang w:eastAsia="es-CL"/>
+              </w:rPr>
+            </w:pPr>
+          </w:p>
+        </w:tc>
+        <w:tc>
+          <w:tcPr>
+            <w:tcW w:w="235" w:type="dxa"/>
+            <w:vAlign w:val="center"/>
+          </w:tcPr>
+          <w:p>
+            <w:pPr>
+              <w:spacing w:after="0" w:line="240" w:lineRule="auto"/>
+              <w:jc w:val="both"/>
+              <w:rPr>
+                <w:rFonts w:eastAsia="Times New Roman" w:cs="Times New Roman"/>
+                <w:sz w:val="16"/>
+                <w:szCs w:val="16"/>
+                <w:lang w:eastAsia="es-CL"/>
+              </w:rPr>
+            </w:pPr>
+          </w:p>
+        </w:tc>
+        <w:tc>
+          <w:tcPr>
+            <w:tcW w:w="282" w:type="dxa"/>
+            <w:vAlign w:val="center"/>
+          </w:tcPr>
+          <w:p>
+            <w:pPr>
+              <w:spacing w:after="0" w:line="240" w:lineRule="auto"/>
+              <w:jc w:val="both"/>
+              <w:rPr>
+                <w:rFonts w:eastAsia="Times New Roman" w:cs="Times New Roman"/>
+                <w:sz w:val="16"/>
+                <w:szCs w:val="16"/>
+                <w:lang w:eastAsia="es-CL"/>
+              </w:rPr>
+            </w:pPr>
+          </w:p>
+        </w:tc>
+        <w:tc>
+          <w:tcPr>
+            <w:tcW w:w="404" w:type="dxa"/>
+            <w:tcBorders>
               <w:right w:val="nil"/>
             </w:tcBorders>
             <w:noWrap/>
             <w:vAlign w:val="bottom"/>
-            <w:hideMark/>
+          </w:tcPr>
+          <w:p>
+            <w:pPr>
+              <w:spacing w:after="0" w:line="240" w:lineRule="auto"/>
+              <w:rPr>
+                <w:rFonts w:eastAsia="Times New Roman" w:cs="Times New Roman"/>
+                <w:lang w:eastAsia="es-CL"/>
+              </w:rPr>
+            </w:pPr>
+          </w:p>
+        </w:tc>
+        <w:tc>
+          <w:tcPr>
+            <w:tcW w:w="2008" w:type="dxa"/>
+            <w:tcBorders>
+              <w:top w:val="nil"/>
+              <w:left w:val="nil"/>
+              <w:right w:val="single" w:sz="4" w:space="0" w:color="auto"/>
+            </w:tcBorders>
+            <w:noWrap/>
+            <w:vAlign w:val="bottom"/>
+          </w:tcPr>
+          <w:p>
+            <w:pPr>
+              <w:spacing w:after="0" w:line="240" w:lineRule="auto"/>
+              <w:rPr>
+                <w:rFonts w:eastAsia="Times New Roman" w:cs="Times New Roman"/>
+                <w:lang w:eastAsia="es-CL"/>
+              </w:rPr>
+            </w:pPr>
+          </w:p>
+        </w:tc>
+        <w:tc>
+          <w:tcPr>
+            <w:tcW w:w="5382" w:type="dxa"/>
+            <w:tcBorders>
+              <w:top w:val="single" w:sz="4" w:space="0" w:color="auto"/>
+              <w:left w:val="single" w:sz="4" w:space="0" w:color="auto"/>
+              <w:bottom w:val="single" w:sz="4" w:space="0" w:color="auto"/>
+              <w:right w:val="single" w:sz="4" w:space="0" w:color="auto"/>
+            </w:tcBorders>
+          </w:tcPr>
+          <w:p>
+            <w:pPr>
+              <w:spacing w:after="0" w:line="240" w:lineRule="auto"/>
+              <w:rPr>
+                <w:rFonts w:eastAsia="Times New Roman" w:cs="Times New Roman"/>
+                <w:lang w:eastAsia="es-CL"/>
+              </w:rPr>
+            </w:pPr>
+          </w:p>
+        </w:tc>
+      </w:tr>
+      <w:tr>
+        <w:trPr>
+          <w:trHeight w:val="300"/>
+        </w:trPr>
+        <w:tc>
+          <w:tcPr>
+            <w:tcW w:w="650" w:type="dxa"/>
+            <w:vAlign w:val="center"/>
+          </w:tcPr>
+          <w:p>
+            <w:pPr>
+              <w:spacing w:after="0" w:line="240" w:lineRule="auto"/>
+              <w:jc w:val="both"/>
+              <w:rPr>
+                <w:rFonts w:eastAsia="Times New Roman" w:cs="Times New Roman"/>
+                <w:sz w:val="16"/>
+                <w:szCs w:val="16"/>
+                <w:lang w:eastAsia="es-CL"/>
+              </w:rPr>
+            </w:pPr>
+          </w:p>
+        </w:tc>
+        <w:tc>
+          <w:tcPr>
+            <w:tcW w:w="253" w:type="dxa"/>
+            <w:vAlign w:val="center"/>
+          </w:tcPr>
+          <w:p>
+            <w:pPr>
+              <w:spacing w:after="0" w:line="240" w:lineRule="auto"/>
+              <w:jc w:val="both"/>
+              <w:rPr>
+                <w:rFonts w:eastAsia="Times New Roman" w:cs="Times New Roman"/>
+                <w:sz w:val="16"/>
+                <w:szCs w:val="16"/>
+                <w:lang w:eastAsia="es-CL"/>
+              </w:rPr>
+            </w:pPr>
+          </w:p>
+        </w:tc>
+        <w:tc>
+          <w:tcPr>
+            <w:tcW w:w="235" w:type="dxa"/>
+            <w:vAlign w:val="center"/>
+          </w:tcPr>
+          <w:p>
+            <w:pPr>
+              <w:spacing w:after="0" w:line="240" w:lineRule="auto"/>
+              <w:jc w:val="both"/>
+              <w:rPr>
+                <w:rFonts w:eastAsia="Times New Roman" w:cs="Times New Roman"/>
+                <w:sz w:val="16"/>
+                <w:szCs w:val="16"/>
+                <w:lang w:eastAsia="es-CL"/>
+              </w:rPr>
+            </w:pPr>
+          </w:p>
+        </w:tc>
+        <w:tc>
+          <w:tcPr>
+            <w:tcW w:w="282" w:type="dxa"/>
+            <w:vAlign w:val="center"/>
+          </w:tcPr>
+          <w:p>
+            <w:pPr>
+              <w:spacing w:after="0" w:line="240" w:lineRule="auto"/>
+              <w:jc w:val="both"/>
+              <w:rPr>
+                <w:rFonts w:eastAsia="Times New Roman" w:cs="Times New Roman"/>
+                <w:sz w:val="16"/>
+                <w:szCs w:val="16"/>
+                <w:lang w:eastAsia="es-CL"/>
+              </w:rPr>
+            </w:pPr>
+          </w:p>
+        </w:tc>
+        <w:tc>
+          <w:tcPr>
+            <w:tcW w:w="404" w:type="dxa"/>
+            <w:tcBorders>
+              <w:right w:val="nil"/>
+            </w:tcBorders>
+            <w:noWrap/>
+            <w:vAlign w:val="bottom"/>
+          </w:tcPr>
+          <w:p>
+            <w:pPr>
+              <w:spacing w:after="0" w:line="240" w:lineRule="auto"/>
+              <w:rPr>
+                <w:rFonts w:eastAsia="Times New Roman" w:cs="Times New Roman"/>
+                <w:lang w:eastAsia="es-CL"/>
+              </w:rPr>
+            </w:pPr>
+          </w:p>
+        </w:tc>
+        <w:tc>
+          <w:tcPr>
+            <w:tcW w:w="2008" w:type="dxa"/>
+            <w:tcBorders>
+              <w:left w:val="nil"/>
+            </w:tcBorders>
+            <w:noWrap/>
+            <w:vAlign w:val="bottom"/>
+          </w:tcPr>
+          <w:p>
+            <w:pPr>
+              <w:spacing w:after="0" w:line="240" w:lineRule="auto"/>
+              <w:rPr>
+                <w:rFonts w:eastAsia="Times New Roman" w:cs="Times New Roman"/>
+                <w:lang w:eastAsia="es-CL"/>
+              </w:rPr>
+            </w:pPr>
+          </w:p>
+        </w:tc>
+        <w:tc>
+          <w:tcPr>
+            <w:tcW w:w="5382" w:type="dxa"/>
+            <w:tcBorders>
+              <w:top w:val="single" w:sz="4" w:space="0" w:color="auto"/>
+            </w:tcBorders>
           </w:tcPr>
           <w:p>
             <w:pPr>
@@ -2922,6 +3558,7 @@
       <w:tblPr>
         <w:tblStyle w:val="Tablaconcuadrcula"/>
         <w:tblW w:w="9245" w:type="dxa"/>
+        <w:tblInd w:w="-5" w:type="dxa"/>
         <w:tblLook w:val="04A0" w:firstRow="1" w:lastRow="0" w:firstColumn="1" w:lastColumn="0" w:noHBand="0" w:noVBand="1"/>
       </w:tblPr>
       <w:tblGrid>
@@ -2929,7 +3566,7 @@
       </w:tblGrid>
       <w:tr>
         <w:trPr>
-          <w:trHeight w:val="1917"/>
+          <w:trHeight w:val="1780"/>
         </w:trPr>
         <w:tc>
           <w:tcPr>
@@ -3000,21 +3637,10 @@
         </w:tc>
       </w:tr>
     </w:tbl>
-    <w:p>
-      <w:pPr>
-        <w:tabs>
-          <w:tab w:val="left" w:pos="2920"/>
-        </w:tabs>
-        <w:rPr>
-          <w:rFonts w:cs="Arial"/>
-          <w:lang w:val="es-ES"/>
-        </w:rPr>
-      </w:pPr>
-    </w:p>
     <w:tbl>
       <w:tblPr>
         <w:tblStyle w:val="Tablaconcuadrcula"/>
-        <w:tblpPr w:leftFromText="141" w:rightFromText="141" w:vertAnchor="text" w:horzAnchor="margin" w:tblpY="242"/>
+        <w:tblpPr w:leftFromText="141" w:rightFromText="141" w:vertAnchor="text" w:horzAnchor="margin" w:tblpY="216"/>
         <w:tblW w:w="9286" w:type="dxa"/>
         <w:tblLook w:val="04A0" w:firstRow="1" w:lastRow="0" w:firstColumn="1" w:lastColumn="0" w:noHBand="0" w:noVBand="1"/>
       </w:tblPr>
@@ -3192,7 +3818,7 @@
     <w:sectPr>
       <w:headerReference w:type="default" r:id="rId6"/>
       <w:pgSz w:w="11906" w:h="16838"/>
-      <w:pgMar w:top="1417" w:right="1701" w:bottom="1417" w:left="1701" w:header="708" w:footer="708" w:gutter="0"/>
+      <w:pgMar w:top="1417" w:right="1701" w:bottom="851" w:left="1418" w:header="708" w:footer="708" w:gutter="0"/>
       <w:cols w:space="708"/>
       <w:docGrid w:linePitch="360"/>
     </w:sectPr>
@@ -3282,7 +3908,7 @@
               <wp:inline distT="0" distB="0" distL="0" distR="0" wp14:anchorId="79A7801F" wp14:editId="29EB15A8">
                 <wp:extent cx="513080" cy="521076"/>
                 <wp:effectExtent l="0" t="0" r="1270" b="0"/>
-                <wp:docPr id="1940249736" name="Imagen 8" descr="Logotipo, Icono&#10;&#10;El contenido generado por IA puede ser incorrecto."/>
+                <wp:docPr id="35842343" name="Imagen 8" descr="Logotipo, Icono&#10;&#10;El contenido generado por IA puede ser incorrecto."/>
                 <wp:cNvGraphicFramePr>
                   <a:graphicFrameLocks xmlns:a="http://schemas.openxmlformats.org/drawingml/2006/main" noChangeAspect="1"/>
                 </wp:cNvGraphicFramePr>
@@ -3520,8 +4146,13 @@
             <w:pStyle w:val="Encabezado"/>
           </w:pPr>
           <w:r>
-            <w:t>R-PAC  PC</w:t>
+            <w:t>R-</w:t>
           </w:r>
+          <w:proofErr w:type="gramStart"/>
+          <w:r>
+            <w:t>PAC  PC</w:t>
+          </w:r>
+          <w:proofErr w:type="gramEnd"/>
           <w:r>
             <w:t>5</w:t>
           </w:r>

</xml_diff>